<commit_message>
refactor: update document generation script and regenerate transaction flow documentation with expanded workflow steps
</commit_message>
<xml_diff>
--- a/Alur_Transaksi_SaaS_Snap.docx
+++ b/Alur_Transaksi_SaaS_Snap.docx
@@ -27,7 +27,7 @@
         <w:pStyle w:val="Heading2"/>
       </w:pPr>
       <w:r>
-        <w:t>Langkah 1: Pilihan Produk</w:t>
+        <w:t>Langkah 1: Pengunjung Melihat Produk</w:t>
       </w:r>
     </w:p>
     <w:p>
@@ -38,7 +38,7 @@
         <w:t xml:space="preserve">Keterangan: </w:t>
       </w:r>
       <w:r>
-        <w:t>User mengunjungi web aplikasi (https://tryout.aryaaji.com) dan memilih Paket Kredit yang tersedia pada tabel harga.</w:t>
+        <w:t>User mengunjungi web aplikasi (https://tryout.aryaaji.com) dan melihat informasi produk serta menekan tombol Login/Daftar.</w:t>
         <w:br/>
         <w:br/>
       </w:r>
@@ -47,7 +47,7 @@
           <w:b/>
           <w:color w:val="FF0000"/>
         </w:rPr>
-        <w:t>[HAPUS TEKS INI DAN MASUKKAN SCREENSHOT TABEL HARGA SKUI DI SINI]</w:t>
+        <w:t>[HAPUS TEKS INI DAN MASUKKAN SCREENSHOT HALAMAN UTAMA SKUI DI SINI]</w:t>
       </w:r>
     </w:p>
     <w:p>
@@ -55,7 +55,7 @@
         <w:pStyle w:val="Heading2"/>
       </w:pPr>
       <w:r>
-        <w:t>Langkah 2: Checkout</w:t>
+        <w:t>Langkah 2: Proses Login ke Aplikasi</w:t>
       </w:r>
     </w:p>
     <w:p>
@@ -66,7 +66,7 @@
         <w:t xml:space="preserve">Keterangan: </w:t>
       </w:r>
       <w:r>
-        <w:t>User mengklik tombol beli dan sistem menampilkan form checkout/login di dalam web SKUI.</w:t>
+        <w:t>User melakukan login ke dalam platform Siap Kuliah UI.</w:t>
         <w:br/>
         <w:br/>
       </w:r>
@@ -75,7 +75,7 @@
           <w:b/>
           <w:color w:val="FF0000"/>
         </w:rPr>
-        <w:t>[HAPUS TEKS INI DAN MASUKKAN SCREENSHOT FORM CHECKOUT DI WEB SKUI DI SINI]</w:t>
+        <w:t>[HAPUS TEKS INI DAN MASUKKAN SCREENSHOT HALAMAN LOGIN SKUI DI SINI]</w:t>
       </w:r>
     </w:p>
     <w:p>
@@ -83,7 +83,63 @@
         <w:pStyle w:val="Heading2"/>
       </w:pPr>
       <w:r>
-        <w:t>Langkah 3: Pembayaran via Snap API</w:t>
+        <w:t>Langkah 3: Masuk ke Menu Wallet</w:t>
+      </w:r>
+    </w:p>
+    <w:p>
+      <w:r>
+        <w:rPr>
+          <w:b/>
+        </w:rPr>
+        <w:t xml:space="preserve">Keterangan: </w:t>
+      </w:r>
+      <w:r>
+        <w:t>Setelah login, user masuk ke menu Wallet (Dompet) untuk melakukan Top Up Kredit.</w:t>
+        <w:br/>
+        <w:br/>
+      </w:r>
+      <w:r>
+        <w:rPr>
+          <w:b/>
+          <w:color w:val="FF0000"/>
+        </w:rPr>
+        <w:t>[HAPUS TEKS INI DAN MASUKKAN SCREENSHOT MENU WALLET DI DALAM SKUI DI SINI]</w:t>
+      </w:r>
+    </w:p>
+    <w:p>
+      <w:pPr>
+        <w:pStyle w:val="Heading2"/>
+      </w:pPr>
+      <w:r>
+        <w:t>Langkah 4: Memilih Paket dan Checkout</w:t>
+      </w:r>
+    </w:p>
+    <w:p>
+      <w:r>
+        <w:rPr>
+          <w:b/>
+        </w:rPr>
+        <w:t xml:space="preserve">Keterangan: </w:t>
+      </w:r>
+      <w:r>
+        <w:t>User memilih nominal/paket kredit yang ingin di-Top Up, kemudian sistem menampilkan rincian harga untuk diproses (Checkout).</w:t>
+        <w:br/>
+        <w:br/>
+      </w:r>
+      <w:r>
+        <w:rPr>
+          <w:b/>
+          <w:color w:val="FF0000"/>
+        </w:rPr>
+        <w:t>[HAPUS TEKS INI DAN MASUKKAN SCREENSHOT PILIHAN PAKET TOP UP KREDIT DI SINI]</w:t>
+      </w:r>
+    </w:p>
+    <w:p>
+      <w:pPr>
+        <w:pStyle w:val="Heading2"/>
+      </w:pPr>
+      <w:r>
+        <w:t>Langkah 5: Pembayaran via Snap API</w:t>
       </w:r>
     </w:p>
     <w:p>

</xml_diff>